<commit_message>
Add automatic sensor generator
</commit_message>
<xml_diff>
--- a/artifacts/Отчет_Криптоброкер_Kafka_мессенджер_сенсоры.docx
+++ b/artifacts/Отчет_Криптоброкер_Kafka_мессенджер_сенсоры.docx
@@ -35,7 +35,7 @@
     </w:p>
     <w:p>
       <w:r>
-        <w:t>Разработать прототип системы обмена сообщениями с криптографической защитой информации. Основной сценарий - защищенный мессенджер. Дополнительно выделен отдельный поток данных датчиков, чтобы показать визуализацию в Grafana.</w:t>
+        <w:t>Разработать прототип системы обмена сообщениями с криптографической защитой информации. Основной сценарий - защищенный мессенджер. Дополнительно выделен автоматический поток данных датчиков, который генерируется отдельным контейнером и подходит для визуализации в Grafana.</w:t>
       </w:r>
     </w:p>
     <w:p>
@@ -51,7 +51,15 @@
         <w:pStyle w:val="ListBullet"/>
       </w:pPr>
       <w:r>
-        <w:t>веб-интерфейс на localhost:8088 для отправки сообщений и значений датчиков;</w:t>
+        <w:t>веб-интерфейс на localhost:8088 для переписки в формате мессенджера;</w:t>
+      </w:r>
+    </w:p>
+    <w:p>
+      <w:pPr>
+        <w:pStyle w:val="ListBullet"/>
+      </w:pPr>
+      <w:r>
+        <w:t>sensor-generator для автоматической отправки температуры и влажности;</w:t>
       </w:r>
     </w:p>
     <w:p>
@@ -294,7 +302,7 @@
     </w:p>
     <w:p>
       <w:r>
-        <w:t>Система разделена на изолированные контейнеры. Web App и producer не имеют ключей расшифрования. Policy-engine принимает решение безопасности, а crypto-gateway применяет это решение. Открытый payload не публикуется в crypto-топики.</w:t>
+        <w:t>Система разделена на изолированные контейнеры. Web App, producer и sensor-generator не имеют ключей расшифрования. Policy-engine принимает решение безопасности, а crypto-gateway применяет это решение. Открытый payload не публикуется в crypto-топики.</w:t>
       </w:r>
     </w:p>
     <w:p>
@@ -452,7 +460,7 @@
           <w:rFonts w:ascii="Consolas" w:hAnsi="Consolas"/>
           <w:sz w:val="17"/>
         </w:rPr>
-        <w:t xml:space="preserve">        allowed_sources: web:chat, web:sensor, producer:chat, producer:sensor, producer:/sample</w:t>
+        <w:t xml:space="preserve">        allowed_sources: web:chat, sensor-generator, producer:chat, producer:sensor, producer:/sample</w:t>
       </w:r>
     </w:p>
     <w:p>
@@ -898,7 +906,7 @@
           <w:rFonts w:ascii="Consolas" w:hAnsi="Consolas"/>
           <w:sz w:val="17"/>
         </w:rPr>
-        <w:t xml:space="preserve">        docker compose up --build -d kafka kafka-init policy-engine crypto-gateway filter consumer app grafana</w:t>
+        <w:t xml:space="preserve">        docker compose up --build -d kafka kafka-init sensor-generator policy-engine crypto-gateway filter consumer app grafana</w:t>
       </w:r>
     </w:p>
     <w:p>
@@ -947,7 +955,7 @@
     </w:p>
     <w:p>
       <w:r>
-        <w:t>Получен прототип кибериммунной системы обмена сообщениями: чат и датчики разделены по топикам, сообщения проходят через политику безопасности, шифруются в криптоконтейнеры и публикуются в итоговые топики только после расшифрования, очистки и валидации.</w:t>
+        <w:t>Получен прототип кибериммунной системы обмена сообщениями: чат и автоматический поток датчиков разделены по топикам, сообщения проходят через политику безопасности, шифруются в криптоконтейнеры и публикуются в итоговые топики только после расшифрования, очистки и валидации.</w:t>
       </w:r>
     </w:p>
     <w:p>

</xml_diff>